<commit_message>
didn't saved word for last work
</commit_message>
<xml_diff>
--- a/CrossPP/LB_3/КроссПП_Смирнов_Б.В._Лабораторная_работа_№3.docx
+++ b/CrossPP/LB_3/КроссПП_Смирнов_Б.В._Лабораторная_работа_№3.docx
@@ -33,7 +33,23 @@
         <w:pStyle w:val="a5"/>
       </w:pPr>
       <w:r>
-        <w:t>Изучит основные методики создания графического пользовательского интерфейса с использованием виджетов QtWidgets. Приобрести навыки разработки интерфейса пользователя для приложений на основе фреймворка Qt.</w:t>
+        <w:t xml:space="preserve">Изучит основные методики создания графического пользовательского интерфейса с использованием виджетов </w:t>
+      </w:r>
+      <w:proofErr w:type="spellStart"/>
+      <w:r>
+        <w:t>QtWidgets</w:t>
+      </w:r>
+      <w:proofErr w:type="spellEnd"/>
+      <w:r>
+        <w:t xml:space="preserve">. Приобрести навыки разработки интерфейса пользователя для приложений на основе фреймворка </w:t>
+      </w:r>
+      <w:proofErr w:type="spellStart"/>
+      <w:r>
+        <w:t>Qt</w:t>
+      </w:r>
+      <w:proofErr w:type="spellEnd"/>
+      <w:r>
+        <w:t>.</w:t>
       </w:r>
     </w:p>
     <w:p>
@@ -70,7 +86,23 @@
         <w:pStyle w:val="a5"/>
       </w:pPr>
       <w:r>
-        <w:t xml:space="preserve">1. Создать проект Qt Gui Application. </w:t>
+        <w:t xml:space="preserve">1. Создать проект </w:t>
+      </w:r>
+      <w:proofErr w:type="spellStart"/>
+      <w:r>
+        <w:t>Qt</w:t>
+      </w:r>
+      <w:proofErr w:type="spellEnd"/>
+      <w:r>
+        <w:t xml:space="preserve"> </w:t>
+      </w:r>
+      <w:proofErr w:type="spellStart"/>
+      <w:r>
+        <w:t>Gui</w:t>
+      </w:r>
+      <w:proofErr w:type="spellEnd"/>
+      <w:r>
+        <w:t xml:space="preserve"> Application. </w:t>
       </w:r>
     </w:p>
     <w:p>
@@ -145,7 +177,47 @@
         <w:t xml:space="preserve">: </w:t>
       </w:r>
       <w:r>
-        <w:t xml:space="preserve">1) Контактная форма (e-mail (Line Edit), имя (Line Edit), тема (Line Edit), текст сообщения (Text Edit)); </w:t>
+        <w:t>1) Контактная форма (</w:t>
+      </w:r>
+      <w:proofErr w:type="spellStart"/>
+      <w:r>
+        <w:t>e-mail</w:t>
+      </w:r>
+      <w:proofErr w:type="spellEnd"/>
+      <w:r>
+        <w:t xml:space="preserve"> (Line </w:t>
+      </w:r>
+      <w:proofErr w:type="spellStart"/>
+      <w:r>
+        <w:t>Edit</w:t>
+      </w:r>
+      <w:proofErr w:type="spellEnd"/>
+      <w:r>
+        <w:t xml:space="preserve">), имя (Line </w:t>
+      </w:r>
+      <w:proofErr w:type="spellStart"/>
+      <w:r>
+        <w:t>Edit</w:t>
+      </w:r>
+      <w:proofErr w:type="spellEnd"/>
+      <w:r>
+        <w:t xml:space="preserve">), тема (Line </w:t>
+      </w:r>
+      <w:proofErr w:type="spellStart"/>
+      <w:r>
+        <w:t>Edit</w:t>
+      </w:r>
+      <w:proofErr w:type="spellEnd"/>
+      <w:r>
+        <w:t xml:space="preserve">), текст сообщения (Text </w:t>
+      </w:r>
+      <w:proofErr w:type="spellStart"/>
+      <w:r>
+        <w:t>Edit</w:t>
+      </w:r>
+      <w:proofErr w:type="spellEnd"/>
+      <w:r>
+        <w:t xml:space="preserve">)); </w:t>
       </w:r>
     </w:p>
     <w:p>
@@ -170,8 +242,21 @@
         <w:t>:</w:t>
       </w:r>
       <w:r>
-        <w:t xml:space="preserve"> Qt designer</w:t>
-      </w:r>
+        <w:t xml:space="preserve"> Q</w:t>
+      </w:r>
+      <w:proofErr w:type="spellStart"/>
+      <w:r>
+        <w:t>t</w:t>
+      </w:r>
+      <w:proofErr w:type="spellEnd"/>
+      <w:r>
+        <w:t xml:space="preserve"> </w:t>
+      </w:r>
+      <w:proofErr w:type="spellStart"/>
+      <w:r>
+        <w:t>designer</w:t>
+      </w:r>
+      <w:proofErr w:type="spellEnd"/>
     </w:p>
     <w:p>
       <w:pPr>
@@ -336,6 +421,21 @@
       <w:r>
         <w:t>.</w:t>
       </w:r>
+    </w:p>
+    <w:p>
+      <w:pPr>
+        <w:pStyle w:val="a5"/>
+        <w:ind w:firstLine="0"/>
+      </w:pPr>
+    </w:p>
+    <w:p>
+      <w:pPr>
+        <w:pStyle w:val="a5"/>
+        <w:ind w:firstLine="0"/>
+        <w:rPr>
+          <w:lang w:val="en-US"/>
+        </w:rPr>
+      </w:pPr>
     </w:p>
     <w:sectPr>
       <w:pgSz w:w="11906" w:h="16838"/>

</xml_diff>